<commit_message>
Update Actividad 1 - Identificar el proyecto tecnológico a trabajar.docx
Se finaliza el docuemnto entregable de la actividad 1, se ajusto l atabla de contenido y se reviso normativas APA.
</commit_message>
<xml_diff>
--- a/Actividad 1 - Identificar el proyecto tecnológico a trabajar.docx
+++ b/Actividad 1 - Identificar el proyecto tecnológico a trabajar.docx
@@ -38,12 +38,12 @@
           <w:lang w:val="es-CO" w:bidi="ar-SA"/>
         </w:rPr>
       </w:r>
-      <w:bookmarkStart w:id="2" w:name="_Toc61935805_Copia_1"/>
+      <w:bookmarkStart w:id="2" w:name="_Toc185035819"/>
       <w:bookmarkStart w:id="3" w:name="_Toc185035946"/>
-      <w:bookmarkStart w:id="4" w:name="_Toc185035819"/>
-      <w:bookmarkStart w:id="5" w:name="_Toc61935805_Copia_1"/>
+      <w:bookmarkStart w:id="4" w:name="_Toc61935805_Copia_1"/>
+      <w:bookmarkStart w:id="5" w:name="_Toc185035819"/>
       <w:bookmarkStart w:id="6" w:name="_Toc185035946"/>
-      <w:bookmarkStart w:id="7" w:name="_Toc185035819"/>
+      <w:bookmarkStart w:id="7" w:name="_Toc61935805_Copia_1"/>
       <w:bookmarkEnd w:id="5"/>
       <w:bookmarkEnd w:id="6"/>
       <w:bookmarkEnd w:id="7"/>
@@ -159,7 +159,7 @@
           <w:lang w:val="es-CO" w:bidi="ar-SA"/>
         </w:rPr>
         <w:drawing>
-          <wp:anchor distT="0" distB="0" distL="0" distR="0" simplePos="0" relativeHeight="36" behindDoc="0" locked="0" layoutInCell="0" allowOverlap="1">
+          <wp:anchor distT="0" distB="0" distL="0" distR="0" simplePos="0" relativeHeight="39" behindDoc="0" locked="0" layoutInCell="0" allowOverlap="1">
             <wp:simplePos x="0" y="0"/>
             <wp:positionH relativeFrom="column">
               <wp:posOffset>1684655</wp:posOffset>
@@ -603,28 +603,28 @@
           <w:lang w:val="es-CO" w:bidi="ar-SA"/>
         </w:rPr>
       </w:pPr>
-      <w:bookmarkStart w:id="8" w:name="_Toc185035946_Copia_1"/>
-      <w:bookmarkStart w:id="9" w:name="_Toc185035819_Copia_1"/>
-      <w:bookmarkStart w:id="10" w:name="_Toc185067740"/>
-      <w:bookmarkStart w:id="11" w:name="_Toc185063559"/>
-      <w:bookmarkStart w:id="12" w:name="_Toc185035952"/>
-      <w:bookmarkStart w:id="13" w:name="_Toc185035825"/>
-      <w:bookmarkStart w:id="14" w:name="_Toc184891792"/>
-      <w:bookmarkStart w:id="15" w:name="_Toc184891358"/>
-      <w:bookmarkStart w:id="16" w:name="_Toc184890569"/>
-      <w:bookmarkStart w:id="17" w:name="_Toc156952358"/>
-      <w:bookmarkStart w:id="18" w:name="_Toc136600878"/>
-      <w:bookmarkStart w:id="19" w:name="_Toc262170287"/>
-      <w:bookmarkStart w:id="20" w:name="_Toc61935807"/>
-      <w:bookmarkStart w:id="21" w:name="_Toc57261154"/>
-      <w:bookmarkStart w:id="22" w:name="_Toc57260719"/>
-      <w:bookmarkStart w:id="23" w:name="_Toc57258726"/>
-      <w:bookmarkStart w:id="24" w:name="_Toc57258424"/>
-      <w:bookmarkStart w:id="25" w:name="_Toc57258272"/>
-      <w:bookmarkStart w:id="26" w:name="_Toc55972098"/>
-      <w:bookmarkStart w:id="27" w:name="_Toc55962868"/>
-      <w:bookmarkStart w:id="28" w:name="_Toc55962767"/>
-      <w:bookmarkStart w:id="29" w:name="_Toc55962612"/>
+      <w:bookmarkStart w:id="8" w:name="_Toc55962612"/>
+      <w:bookmarkStart w:id="9" w:name="_Toc55962767"/>
+      <w:bookmarkStart w:id="10" w:name="_Toc55962868"/>
+      <w:bookmarkStart w:id="11" w:name="_Toc55972098"/>
+      <w:bookmarkStart w:id="12" w:name="_Toc57258272"/>
+      <w:bookmarkStart w:id="13" w:name="_Toc57258424"/>
+      <w:bookmarkStart w:id="14" w:name="_Toc57258726"/>
+      <w:bookmarkStart w:id="15" w:name="_Toc57260719"/>
+      <w:bookmarkStart w:id="16" w:name="_Toc57261154"/>
+      <w:bookmarkStart w:id="17" w:name="_Toc61935807"/>
+      <w:bookmarkStart w:id="18" w:name="_Toc262170287"/>
+      <w:bookmarkStart w:id="19" w:name="_Toc136600878"/>
+      <w:bookmarkStart w:id="20" w:name="_Toc156952358"/>
+      <w:bookmarkStart w:id="21" w:name="_Toc184890569"/>
+      <w:bookmarkStart w:id="22" w:name="_Toc184891358"/>
+      <w:bookmarkStart w:id="23" w:name="_Toc184891792"/>
+      <w:bookmarkStart w:id="24" w:name="_Toc185035825"/>
+      <w:bookmarkStart w:id="25" w:name="_Toc185035952"/>
+      <w:bookmarkStart w:id="26" w:name="_Toc185063559"/>
+      <w:bookmarkStart w:id="27" w:name="_Toc185067740"/>
+      <w:bookmarkStart w:id="28" w:name="_Toc185035819_Copia_1"/>
+      <w:bookmarkStart w:id="29" w:name="_Toc185035946_Copia_1"/>
       <w:bookmarkEnd w:id="8"/>
       <w:bookmarkEnd w:id="9"/>
       <w:bookmarkEnd w:id="10"/>
@@ -698,7 +698,7 @@
           </w:r>
           <w:r>
             <w:rPr>
-              <w:rStyle w:val="Enlacedelndice"/>
+              <w:rStyle w:val="Enlacedelndiceuser"/>
               <w:vanish w:val="false"/>
               <w:lang w:val="es-CO" w:eastAsia="en-US" w:bidi="ar-SA"/>
             </w:rPr>
@@ -706,7 +706,7 @@
           </w:r>
           <w:r>
             <w:rPr>
-              <w:rStyle w:val="Enlacedelndice"/>
+              <w:rStyle w:val="Enlacedelndiceuser"/>
               <w:vanish w:val="false"/>
               <w:lang w:val="es-CO" w:eastAsia="en-US" w:bidi="ar-SA"/>
             </w:rPr>
@@ -714,7 +714,7 @@
           </w:r>
           <w:r>
             <w:rPr>
-              <w:rStyle w:val="Enlacedelndice"/>
+              <w:rStyle w:val="Enlacedelndiceuser"/>
               <w:vanish w:val="false"/>
               <w:lang w:val="es-CO" w:eastAsia="en-US" w:bidi="ar-SA"/>
             </w:rPr>
@@ -738,39 +738,14 @@
               <w:t xml:space="preserve">Introducción </w:t>
               <w:tab/>
             </w:r>
-            <w:r>
-              <w:rPr>
-                <w:webHidden/>
-              </w:rPr>
-              <w:fldChar w:fldCharType="begin"/>
-            </w:r>
-            <w:r>
-              <w:rPr>
-                <w:webHidden/>
-              </w:rPr>
-              <w:instrText xml:space="preserve">PAGEREF _Toc62801083 \h</w:instrText>
-            </w:r>
-            <w:r>
-              <w:rPr>
-                <w:webHidden/>
-              </w:rPr>
-              <w:fldChar w:fldCharType="separate"/>
-            </w:r>
-            <w:r>
-              <w:rPr>
-                <w:rStyle w:val="Enlacedelndice"/>
-                <w:vanish w:val="false"/>
-                <w:lang w:val="es-CO" w:eastAsia="en-US" w:bidi="ar-SA"/>
-              </w:rPr>
-              <w:t>3</w:t>
-            </w:r>
-            <w:r>
-              <w:rPr>
-                <w:webHidden/>
-              </w:rPr>
-              <w:fldChar w:fldCharType="end"/>
-            </w:r>
           </w:hyperlink>
+          <w:r>
+            <w:rPr>
+              <w:vanish w:val="false"/>
+              <w:lang w:val="es-CO" w:eastAsia="en-US" w:bidi="ar-SA"/>
+            </w:rPr>
+            <w:t>4</w:t>
+          </w:r>
         </w:p>
         <w:p>
           <w:pPr>
@@ -797,8 +772,10 @@
             </w:r>
           </w:hyperlink>
           <w:r>
-            <w:rPr/>
-            <w:t>3</w:t>
+            <w:rPr>
+              <w:vanish w:val="false"/>
+            </w:rPr>
+            <w:t>4</w:t>
           </w:r>
         </w:p>
         <w:p>
@@ -826,8 +803,10 @@
             </w:r>
           </w:hyperlink>
           <w:r>
-            <w:rPr/>
-            <w:t>3</w:t>
+            <w:rPr>
+              <w:vanish w:val="false"/>
+            </w:rPr>
+            <w:t>4</w:t>
           </w:r>
         </w:p>
         <w:p>
@@ -855,8 +834,10 @@
             </w:r>
           </w:hyperlink>
           <w:r>
-            <w:rPr/>
-            <w:t>3</w:t>
+            <w:rPr>
+              <w:vanish w:val="false"/>
+            </w:rPr>
+            <w:t>4</w:t>
           </w:r>
         </w:p>
         <w:p>
@@ -895,7 +876,7 @@
               <w:vanish w:val="false"/>
               <w:lang w:val="es-CO" w:eastAsia="en-US" w:bidi="ar-SA"/>
             </w:rPr>
-            <w:t>4</w:t>
+            <w:t>5</w:t>
           </w:r>
         </w:p>
         <w:p>
@@ -916,14 +897,17 @@
             <w:r>
               <w:rPr>
                 <w:rStyle w:val="Enlacedelndice"/>
+                <w:vanish w:val="false"/>
                 <w:webHidden/>
               </w:rPr>
               <w:tab/>
             </w:r>
           </w:hyperlink>
           <w:r>
-            <w:rPr/>
-            <w:t>3</w:t>
+            <w:rPr>
+              <w:vanish w:val="false"/>
+            </w:rPr>
+            <w:t>5</w:t>
           </w:r>
         </w:p>
         <w:p>
@@ -938,28 +922,23 @@
           </w:pPr>
           <w:r>
             <w:rPr/>
-            <w:t>2.</w:t>
-          </w:r>
-          <w:r>
-            <w:rPr/>
-            <w:t>2</w:t>
-          </w:r>
-          <w:r>
-            <w:rPr/>
-            <w:t xml:space="preserve"> Mapa mental del CVDS</w:t>
+            <w:t>2.2 Mapa mental del CVDS</w:t>
           </w:r>
           <w:hyperlink w:anchor="_Toc62801090">
             <w:r>
               <w:rPr>
                 <w:rStyle w:val="Enlacedelndice"/>
+                <w:vanish w:val="false"/>
                 <w:webHidden/>
               </w:rPr>
               <w:tab/>
             </w:r>
           </w:hyperlink>
           <w:r>
-            <w:rPr/>
-            <w:t>3</w:t>
+            <w:rPr>
+              <w:vanish w:val="false"/>
+            </w:rPr>
+            <w:t>6</w:t>
           </w:r>
         </w:p>
         <w:p>
@@ -998,7 +977,7 @@
               <w:vanish w:val="false"/>
               <w:lang w:val="es-CO" w:eastAsia="en-US" w:bidi="ar-SA"/>
             </w:rPr>
-            <w:t>5</w:t>
+            <w:t>6</w:t>
           </w:r>
         </w:p>
         <w:p>
@@ -1013,32 +992,23 @@
           </w:pPr>
           <w:r>
             <w:rPr/>
-            <w:t>3</w:t>
-          </w:r>
-          <w:r>
-            <w:rPr/>
-            <w:t>.</w:t>
-          </w:r>
-          <w:r>
-            <w:rPr/>
-            <w:t>1</w:t>
-          </w:r>
-          <w:r>
-            <w:rPr/>
-            <w:t xml:space="preserve"> Justificación de la metodología seleccionada</w:t>
+            <w:t>3.1 Justificación de la metodología seleccionada</w:t>
           </w:r>
           <w:hyperlink w:anchor="_Toc62801090">
             <w:r>
               <w:rPr>
                 <w:rStyle w:val="Enlacedelndice"/>
+                <w:vanish w:val="false"/>
                 <w:webHidden/>
               </w:rPr>
               <w:tab/>
             </w:r>
           </w:hyperlink>
           <w:r>
-            <w:rPr/>
-            <w:t>3</w:t>
+            <w:rPr>
+              <w:vanish w:val="false"/>
+            </w:rPr>
+            <w:t>6</w:t>
           </w:r>
         </w:p>
         <w:p>
@@ -1053,32 +1023,23 @@
           </w:pPr>
           <w:r>
             <w:rPr/>
-            <w:t>3</w:t>
-          </w:r>
-          <w:r>
-            <w:rPr/>
-            <w:t>.</w:t>
-          </w:r>
-          <w:r>
-            <w:rPr/>
-            <w:t>2</w:t>
-          </w:r>
-          <w:r>
-            <w:rPr/>
-            <w:t xml:space="preserve"> Tablero de gestión del proyecto</w:t>
+            <w:t>3.2 Tablero de gestión del proyecto</w:t>
           </w:r>
           <w:hyperlink w:anchor="_Toc62801090">
             <w:r>
               <w:rPr>
                 <w:rStyle w:val="Enlacedelndice"/>
+                <w:vanish w:val="false"/>
                 <w:webHidden/>
               </w:rPr>
               <w:tab/>
             </w:r>
           </w:hyperlink>
           <w:r>
-            <w:rPr/>
-            <w:t>3</w:t>
+            <w:rPr>
+              <w:vanish w:val="false"/>
+            </w:rPr>
+            <w:t>7</w:t>
           </w:r>
         </w:p>
         <w:p>
@@ -1093,32 +1054,23 @@
           </w:pPr>
           <w:r>
             <w:rPr/>
-            <w:t>3</w:t>
-          </w:r>
-          <w:r>
-            <w:rPr/>
-            <w:t>.</w:t>
-          </w:r>
-          <w:r>
-            <w:rPr/>
-            <w:t>3</w:t>
-          </w:r>
-          <w:r>
-            <w:rPr/>
-            <w:t xml:space="preserve"> Organización por sprints o fases ágiles</w:t>
+            <w:t>3.3 Organización por sprints o fases ágiles</w:t>
           </w:r>
           <w:hyperlink w:anchor="_Toc62801090">
             <w:r>
               <w:rPr>
                 <w:rStyle w:val="Enlacedelndice"/>
+                <w:vanish w:val="false"/>
                 <w:webHidden/>
               </w:rPr>
               <w:tab/>
             </w:r>
           </w:hyperlink>
           <w:r>
-            <w:rPr/>
-            <w:t>3</w:t>
+            <w:rPr>
+              <w:vanish w:val="false"/>
+            </w:rPr>
+            <w:t>7</w:t>
           </w:r>
         </w:p>
         <w:p>
@@ -1153,7 +1105,7 @@
             <w:rPr>
               <w:vanish w:val="false"/>
             </w:rPr>
-            <w:t>6</w:t>
+            <w:t>8</w:t>
           </w:r>
         </w:p>
         <w:p>
@@ -1168,32 +1120,23 @@
           </w:pPr>
           <w:r>
             <w:rPr/>
-            <w:t>4</w:t>
-          </w:r>
-          <w:r>
-            <w:rPr/>
-            <w:t>.</w:t>
-          </w:r>
-          <w:r>
-            <w:rPr/>
-            <w:t>1</w:t>
-          </w:r>
-          <w:r>
-            <w:rPr/>
-            <w:t xml:space="preserve"> Proceso de investigación con usuarios</w:t>
+            <w:t>4.1 Proceso de investigación con usuarios</w:t>
           </w:r>
           <w:hyperlink w:anchor="_Toc62801090">
             <w:r>
               <w:rPr>
                 <w:rStyle w:val="Enlacedelndice"/>
+                <w:vanish w:val="false"/>
                 <w:webHidden/>
               </w:rPr>
               <w:tab/>
             </w:r>
           </w:hyperlink>
           <w:r>
-            <w:rPr/>
-            <w:t>3</w:t>
+            <w:rPr>
+              <w:vanish w:val="false"/>
+            </w:rPr>
+            <w:t>8</w:t>
           </w:r>
         </w:p>
         <w:p>
@@ -1214,14 +1157,17 @@
             <w:r>
               <w:rPr>
                 <w:rStyle w:val="Enlacedelndice"/>
+                <w:vanish w:val="false"/>
                 <w:webHidden/>
               </w:rPr>
               <w:tab/>
             </w:r>
           </w:hyperlink>
           <w:r>
-            <w:rPr/>
-            <w:t>3</w:t>
+            <w:rPr>
+              <w:vanish w:val="false"/>
+            </w:rPr>
+            <w:t>8</w:t>
           </w:r>
         </w:p>
         <w:p>
@@ -1236,28 +1182,23 @@
           </w:pPr>
           <w:r>
             <w:rPr/>
-            <w:t>4.</w:t>
-          </w:r>
-          <w:r>
-            <w:rPr/>
-            <w:t>2</w:t>
-          </w:r>
-          <w:r>
-            <w:rPr/>
-            <w:t xml:space="preserve"> User Persona</w:t>
+            <w:t>4.2 User Persona</w:t>
           </w:r>
           <w:hyperlink w:anchor="_Toc62801090">
             <w:r>
               <w:rPr>
                 <w:rStyle w:val="Enlacedelndice"/>
+                <w:vanish w:val="false"/>
                 <w:webHidden/>
               </w:rPr>
               <w:tab/>
             </w:r>
           </w:hyperlink>
           <w:r>
-            <w:rPr/>
-            <w:t>3</w:t>
+            <w:rPr>
+              <w:vanish w:val="false"/>
+            </w:rPr>
+            <w:t>8</w:t>
           </w:r>
         </w:p>
         <w:p>
@@ -1272,28 +1213,23 @@
           </w:pPr>
           <w:r>
             <w:rPr/>
-            <w:t>4.</w:t>
-          </w:r>
-          <w:r>
-            <w:rPr/>
-            <w:t>3</w:t>
-          </w:r>
-          <w:r>
-            <w:rPr/>
-            <w:t xml:space="preserve"> Mapa de empatía</w:t>
+            <w:t>4.3 Mapa de empatía</w:t>
           </w:r>
           <w:hyperlink w:anchor="_Toc62801090">
             <w:r>
               <w:rPr>
                 <w:rStyle w:val="Enlacedelndice"/>
+                <w:vanish w:val="false"/>
                 <w:webHidden/>
               </w:rPr>
               <w:tab/>
             </w:r>
           </w:hyperlink>
           <w:r>
-            <w:rPr/>
-            <w:t>3</w:t>
+            <w:rPr>
+              <w:vanish w:val="false"/>
+            </w:rPr>
+            <w:t>9</w:t>
           </w:r>
         </w:p>
         <w:p>
@@ -1308,28 +1244,23 @@
           </w:pPr>
           <w:r>
             <w:rPr/>
-            <w:t>4.</w:t>
-          </w:r>
-          <w:r>
-            <w:rPr/>
-            <w:t>4</w:t>
-          </w:r>
-          <w:r>
-            <w:rPr/>
-            <w:t xml:space="preserve"> Punto de vista (POV)</w:t>
+            <w:t>4.4 Punto de vista (POV)</w:t>
           </w:r>
           <w:hyperlink w:anchor="_Toc62801090">
             <w:r>
               <w:rPr>
                 <w:rStyle w:val="Enlacedelndice"/>
+                <w:vanish w:val="false"/>
                 <w:webHidden/>
               </w:rPr>
               <w:tab/>
             </w:r>
           </w:hyperlink>
           <w:r>
-            <w:rPr/>
-            <w:t>3</w:t>
+            <w:rPr>
+              <w:vanish w:val="false"/>
+            </w:rPr>
+            <w:t>9</w:t>
           </w:r>
         </w:p>
         <w:p>
@@ -1344,28 +1275,23 @@
           </w:pPr>
           <w:r>
             <w:rPr/>
-            <w:t>4.</w:t>
-          </w:r>
-          <w:r>
-            <w:rPr/>
-            <w:t>5</w:t>
-          </w:r>
-          <w:r>
-            <w:rPr/>
-            <w:t xml:space="preserve"> Ideación y propuesta de solución</w:t>
+            <w:t>4.5 Ideación y propuesta de solución</w:t>
           </w:r>
           <w:hyperlink w:anchor="_Toc62801090">
             <w:r>
               <w:rPr>
                 <w:rStyle w:val="Enlacedelndice"/>
+                <w:vanish w:val="false"/>
                 <w:webHidden/>
               </w:rPr>
               <w:tab/>
             </w:r>
           </w:hyperlink>
           <w:r>
-            <w:rPr/>
-            <w:t>3</w:t>
+            <w:rPr>
+              <w:vanish w:val="false"/>
+            </w:rPr>
+            <w:t>10</w:t>
           </w:r>
         </w:p>
         <w:p>
@@ -1404,7 +1330,14 @@
               <w:vanish w:val="false"/>
               <w:lang w:val="es-CO" w:eastAsia="en-US" w:bidi="ar-SA"/>
             </w:rPr>
-            <w:t xml:space="preserve"> 7</w:t>
+            <w:t xml:space="preserve"> </w:t>
+          </w:r>
+          <w:r>
+            <w:rPr>
+              <w:vanish w:val="false"/>
+              <w:lang w:val="es-CO" w:eastAsia="en-US" w:bidi="ar-SA"/>
+            </w:rPr>
+            <w:t>10</w:t>
           </w:r>
         </w:p>
         <w:p>
@@ -1432,8 +1365,10 @@
             </w:r>
           </w:hyperlink>
           <w:r>
-            <w:rPr/>
-            <w:t>7</w:t>
+            <w:rPr>
+              <w:vanish w:val="false"/>
+            </w:rPr>
+            <w:t>10</w:t>
           </w:r>
         </w:p>
         <w:p>
@@ -1461,8 +1396,10 @@
             </w:r>
           </w:hyperlink>
           <w:r>
-            <w:rPr/>
-            <w:t>7</w:t>
+            <w:rPr>
+              <w:vanish w:val="false"/>
+            </w:rPr>
+            <w:t>11</w:t>
           </w:r>
         </w:p>
         <w:p>
@@ -1490,8 +1427,10 @@
             </w:r>
           </w:hyperlink>
           <w:r>
-            <w:rPr/>
-            <w:t>7</w:t>
+            <w:rPr>
+              <w:vanish w:val="false"/>
+            </w:rPr>
+            <w:t>12</w:t>
           </w:r>
         </w:p>
         <w:p>
@@ -1525,7 +1464,13 @@
             <w:rPr>
               <w:lang w:val="es-CO"/>
             </w:rPr>
-            <w:t xml:space="preserve"> 8</w:t>
+            <w:t xml:space="preserve"> </w:t>
+          </w:r>
+          <w:r>
+            <w:rPr>
+              <w:lang w:val="es-CO"/>
+            </w:rPr>
+            <w:t>12</w:t>
           </w:r>
         </w:p>
         <w:p>
@@ -1560,7 +1505,7 @@
               <w:vanish w:val="false"/>
               <w:lang w:val="es-CO"/>
             </w:rPr>
-            <w:t>8</w:t>
+            <w:t>12</w:t>
           </w:r>
         </w:p>
         <w:p>
@@ -1591,7 +1536,7 @@
             <w:rPr>
               <w:vanish w:val="false"/>
             </w:rPr>
-            <w:t>8</w:t>
+            <w:t>13</w:t>
           </w:r>
         </w:p>
         <w:p>
@@ -1622,7 +1567,7 @@
             <w:rPr>
               <w:vanish w:val="false"/>
             </w:rPr>
-            <w:t>9</w:t>
+            <w:t>14</w:t>
           </w:r>
         </w:p>
         <w:p>
@@ -1658,7 +1603,14 @@
               <w:vanish w:val="false"/>
               <w:lang w:val="es-CO" w:eastAsia="en-US" w:bidi="ar-SA"/>
             </w:rPr>
-            <w:t xml:space="preserve"> 10</w:t>
+            <w:t xml:space="preserve"> 1</w:t>
+          </w:r>
+          <w:r>
+            <w:rPr>
+              <w:vanish w:val="false"/>
+              <w:lang w:val="es-CO" w:eastAsia="en-US" w:bidi="ar-SA"/>
+            </w:rPr>
+            <w:t>4</w:t>
           </w:r>
         </w:p>
         <w:p>
@@ -1694,7 +1646,14 @@
               <w:vanish w:val="false"/>
               <w:lang w:val="es-CO" w:eastAsia="en-US" w:bidi="ar-SA"/>
             </w:rPr>
-            <w:t>10</w:t>
+            <w:t>1</w:t>
+          </w:r>
+          <w:r>
+            <w:rPr>
+              <w:vanish w:val="false"/>
+              <w:lang w:val="es-CO" w:eastAsia="en-US" w:bidi="ar-SA"/>
+            </w:rPr>
+            <w:t>4</w:t>
           </w:r>
         </w:p>
         <w:p>
@@ -1725,7 +1684,13 @@
             <w:rPr>
               <w:vanish w:val="false"/>
             </w:rPr>
-            <w:t>10</w:t>
+            <w:t>1</w:t>
+          </w:r>
+          <w:r>
+            <w:rPr>
+              <w:vanish w:val="false"/>
+            </w:rPr>
+            <w:t>5</w:t>
           </w:r>
         </w:p>
         <w:p>
@@ -1756,7 +1721,13 @@
             <w:rPr>
               <w:vanish w:val="false"/>
             </w:rPr>
-            <w:t>11</w:t>
+            <w:t>1</w:t>
+          </w:r>
+          <w:r>
+            <w:rPr>
+              <w:vanish w:val="false"/>
+            </w:rPr>
+            <w:t>5</w:t>
           </w:r>
         </w:p>
         <w:p>
@@ -1787,7 +1758,13 @@
             <w:rPr>
               <w:vanish w:val="false"/>
             </w:rPr>
-            <w:t>11</w:t>
+            <w:t>1</w:t>
+          </w:r>
+          <w:r>
+            <w:rPr>
+              <w:vanish w:val="false"/>
+            </w:rPr>
+            <w:t>6</w:t>
           </w:r>
         </w:p>
         <w:p>
@@ -1818,7 +1795,13 @@
             <w:rPr>
               <w:vanish w:val="false"/>
             </w:rPr>
-            <w:t>12</w:t>
+            <w:t>1</w:t>
+          </w:r>
+          <w:r>
+            <w:rPr>
+              <w:vanish w:val="false"/>
+            </w:rPr>
+            <w:t>6</w:t>
           </w:r>
         </w:p>
         <w:p>
@@ -1857,7 +1840,14 @@
               <w:vanish w:val="false"/>
               <w:lang w:val="es-CO" w:eastAsia="en-US" w:bidi="ar-SA"/>
             </w:rPr>
-            <w:t>13</w:t>
+            <w:t>1</w:t>
+          </w:r>
+          <w:r>
+            <w:rPr>
+              <w:vanish w:val="false"/>
+              <w:lang w:val="es-CO" w:eastAsia="en-US" w:bidi="ar-SA"/>
+            </w:rPr>
+            <w:t>7</w:t>
           </w:r>
         </w:p>
         <w:p>
@@ -1875,24 +1865,13 @@
           </w:pPr>
           <w:r>
             <w:rPr/>
-            <w:t>9</w:t>
-          </w:r>
-          <w:r>
-            <w:rPr/>
-            <w:t xml:space="preserve">. </w:t>
-          </w:r>
-          <w:r>
-            <w:rPr/>
-            <w:t>Anexos</w:t>
-          </w:r>
-          <w:r>
-            <w:rPr/>
-            <w:t xml:space="preserve"> </w:t>
+            <w:t xml:space="preserve">9. Anexos </w:t>
           </w:r>
           <w:hyperlink w:anchor="_Toc62801091">
             <w:r>
               <w:rPr>
                 <w:rStyle w:val="Enlacedelndice"/>
+                <w:vanish w:val="false"/>
                 <w:webHidden/>
               </w:rPr>
               <w:tab/>
@@ -1900,7 +1879,11 @@
           </w:hyperlink>
           <w:r>
             <w:rPr/>
-            <w:t>13</w:t>
+            <w:t>1</w:t>
+          </w:r>
+          <w:r>
+            <w:rPr/>
+            <w:t>7</w:t>
           </w:r>
           <w:r>
             <w:rPr/>
@@ -1942,7 +1925,8 @@
       </w:pPr>
       <w:r>
         <w:rPr>
-          <w:lang w:val="es-CO" w:bidi="ar-SA"/>
+          <w:vanish w:val="false"/>
+          <w:lang w:val="es-CO" w:eastAsia="en-US" w:bidi="ar-SA"/>
         </w:rPr>
       </w:r>
       <w:r>
@@ -1960,26 +1944,26 @@
           <w:rFonts w:ascii="Times New Roman" w:hAnsi="Times New Roman"/>
         </w:rPr>
       </w:pPr>
-      <w:bookmarkStart w:id="30" w:name="_Toc136600878_Copia_1"/>
-      <w:bookmarkStart w:id="31" w:name="_Toc262170287_Copia_1"/>
-      <w:bookmarkStart w:id="32" w:name="_Toc61935807_Copia_1"/>
-      <w:bookmarkStart w:id="33" w:name="_Toc57261154_Copia_1"/>
-      <w:bookmarkStart w:id="34" w:name="_Toc57260719_Copia_1"/>
-      <w:bookmarkStart w:id="35" w:name="_Toc57258726_Copia_1"/>
-      <w:bookmarkStart w:id="36" w:name="_Toc57258424_Copia_1"/>
-      <w:bookmarkStart w:id="37" w:name="_Toc57258272_Copia_1"/>
-      <w:bookmarkStart w:id="38" w:name="_Toc55972098_Copia_1"/>
-      <w:bookmarkStart w:id="39" w:name="_Toc55962868_Copia_1"/>
-      <w:bookmarkStart w:id="40" w:name="_Toc55962767_Copia_1"/>
-      <w:bookmarkStart w:id="41" w:name="_Toc55962612_Copia_1"/>
-      <w:bookmarkStart w:id="42" w:name="_Toc185067740_Copia_1"/>
-      <w:bookmarkStart w:id="43" w:name="_Toc185063559_Copia_1"/>
-      <w:bookmarkStart w:id="44" w:name="_Toc185035952_Copia_1"/>
-      <w:bookmarkStart w:id="45" w:name="_Toc185035825_Copia_1"/>
-      <w:bookmarkStart w:id="46" w:name="_Toc184891792_Copia_1"/>
-      <w:bookmarkStart w:id="47" w:name="_Toc184891358_Copia_1"/>
-      <w:bookmarkStart w:id="48" w:name="_Toc184890569_Copia_1"/>
-      <w:bookmarkStart w:id="49" w:name="_Toc156952358_Copia_1"/>
+      <w:bookmarkStart w:id="30" w:name="_Toc156952358_Copia_1"/>
+      <w:bookmarkStart w:id="31" w:name="_Toc184890569_Copia_1"/>
+      <w:bookmarkStart w:id="32" w:name="_Toc184891358_Copia_1"/>
+      <w:bookmarkStart w:id="33" w:name="_Toc184891792_Copia_1"/>
+      <w:bookmarkStart w:id="34" w:name="_Toc185035825_Copia_1"/>
+      <w:bookmarkStart w:id="35" w:name="_Toc185035952_Copia_1"/>
+      <w:bookmarkStart w:id="36" w:name="_Toc185063559_Copia_1"/>
+      <w:bookmarkStart w:id="37" w:name="_Toc185067740_Copia_1"/>
+      <w:bookmarkStart w:id="38" w:name="_Toc55962612_Copia_1"/>
+      <w:bookmarkStart w:id="39" w:name="_Toc55962767_Copia_1"/>
+      <w:bookmarkStart w:id="40" w:name="_Toc55962868_Copia_1"/>
+      <w:bookmarkStart w:id="41" w:name="_Toc55972098_Copia_1"/>
+      <w:bookmarkStart w:id="42" w:name="_Toc57258272_Copia_1"/>
+      <w:bookmarkStart w:id="43" w:name="_Toc57258424_Copia_1"/>
+      <w:bookmarkStart w:id="44" w:name="_Toc57258726_Copia_1"/>
+      <w:bookmarkStart w:id="45" w:name="_Toc57260719_Copia_1"/>
+      <w:bookmarkStart w:id="46" w:name="_Toc57261154_Copia_1"/>
+      <w:bookmarkStart w:id="47" w:name="_Toc61935807_Copia_1"/>
+      <w:bookmarkStart w:id="48" w:name="_Toc262170287_Copia_1"/>
+      <w:bookmarkStart w:id="49" w:name="_Toc136600878_Copia_1"/>
       <w:bookmarkEnd w:id="30"/>
       <w:bookmarkEnd w:id="31"/>
       <w:bookmarkEnd w:id="32"/>
@@ -2002,22 +1986,20 @@
       <w:bookmarkEnd w:id="49"/>
       <w:r>
         <w:rPr>
-          <w:rFonts w:ascii="Times New Roman" w:hAnsi="Times New Roman"/>
           <w:lang w:val="es-CO" w:bidi="ar-SA"/>
         </w:rPr>
         <w:t xml:space="preserve">1 </w:t>
       </w:r>
-      <w:bookmarkStart w:id="50" w:name="_Toc62801083"/>
-      <w:bookmarkStart w:id="51" w:name="_Toc62800635"/>
-      <w:bookmarkStart w:id="52" w:name="_Toc62800548"/>
-      <w:bookmarkStart w:id="53" w:name="_Toc62800392"/>
-      <w:bookmarkStart w:id="54" w:name="_Toc62799672"/>
-      <w:bookmarkStart w:id="55" w:name="_Toc26079248"/>
-      <w:bookmarkStart w:id="56" w:name="_Toc26076889"/>
-      <w:bookmarkStart w:id="57" w:name="_Toc316718173"/>
-      <w:r>
-        <w:rPr>
-          <w:rFonts w:ascii="Times New Roman" w:hAnsi="Times New Roman"/>
+      <w:bookmarkStart w:id="50" w:name="_Toc316718173"/>
+      <w:bookmarkStart w:id="51" w:name="_Toc26076889"/>
+      <w:bookmarkStart w:id="52" w:name="_Toc26079248"/>
+      <w:bookmarkStart w:id="53" w:name="_Toc62799672"/>
+      <w:bookmarkStart w:id="54" w:name="_Toc62800392"/>
+      <w:bookmarkStart w:id="55" w:name="_Toc62800548"/>
+      <w:bookmarkStart w:id="56" w:name="_Toc62800635"/>
+      <w:bookmarkStart w:id="57" w:name="_Toc62801083"/>
+      <w:r>
+        <w:rPr>
           <w:lang w:val="es-CO" w:bidi="ar-SA"/>
         </w:rPr>
         <w:t xml:space="preserve">Introducción </w:t>
@@ -2051,7 +2033,7 @@
       </w:pPr>
       <w:r>
         <w:rPr>
-          <w:rFonts w:eastAsia="Times New Roman" w:cs="Times New Roman" w:ascii="Times New Roman" w:hAnsi="Times New Roman"/>
+          <w:rFonts w:eastAsia="Times New Roman" w:cs="Times New Roman"/>
           <w:color w:val="000000"/>
           <w:kern w:val="0"/>
           <w:sz w:val="24"/>
@@ -2082,7 +2064,7 @@
       </w:pPr>
       <w:r>
         <w:rPr>
-          <w:rFonts w:eastAsia="Times New Roman" w:cs="Times New Roman" w:ascii="Times New Roman" w:hAnsi="Times New Roman"/>
+          <w:rFonts w:eastAsia="Times New Roman" w:cs="Times New Roman"/>
           <w:color w:val="000000"/>
           <w:kern w:val="0"/>
           <w:sz w:val="24"/>
@@ -2112,7 +2094,7 @@
       </w:pPr>
       <w:r>
         <w:rPr>
-          <w:rFonts w:eastAsia="Times New Roman" w:cs="Times New Roman" w:ascii="Times New Roman" w:hAnsi="Times New Roman"/>
+          <w:rFonts w:eastAsia="Times New Roman" w:cs="Times New Roman"/>
           <w:color w:val="000000"/>
           <w:kern w:val="0"/>
           <w:sz w:val="24"/>
@@ -2143,7 +2125,7 @@
       </w:pPr>
       <w:r>
         <w:rPr>
-          <w:rFonts w:eastAsia="Times New Roman" w:cs="Times New Roman" w:ascii="Times New Roman" w:hAnsi="Times New Roman"/>
+          <w:rFonts w:eastAsia="Times New Roman" w:cs="Times New Roman"/>
           <w:color w:val="000000"/>
           <w:kern w:val="0"/>
           <w:sz w:val="24"/>
@@ -2173,7 +2155,7 @@
       </w:pPr>
       <w:r>
         <w:rPr>
-          <w:rFonts w:eastAsia="Times New Roman" w:cs="Times New Roman" w:ascii="Times New Roman" w:hAnsi="Times New Roman"/>
+          <w:rFonts w:eastAsia="Times New Roman" w:cs="Times New Roman"/>
           <w:color w:val="000000"/>
           <w:kern w:val="0"/>
           <w:sz w:val="24"/>
@@ -2205,7 +2187,7 @@
       </w:pPr>
       <w:r>
         <w:rPr>
-          <w:rFonts w:eastAsia="Times New Roman" w:cs="Times New Roman" w:ascii="Times New Roman" w:hAnsi="Times New Roman"/>
+          <w:rFonts w:eastAsia="Times New Roman" w:cs="Times New Roman"/>
           <w:color w:val="000000"/>
           <w:kern w:val="0"/>
           <w:sz w:val="24"/>
@@ -2379,7 +2361,7 @@
       </w:pPr>
       <w:r>
         <w:rPr>
-          <w:rFonts w:eastAsia="Times New Roman" w:cs="Times New Roman" w:ascii="Times New Roman" w:hAnsi="Times New Roman"/>
+          <w:rFonts w:eastAsia="Times New Roman" w:cs="Times New Roman"/>
           <w:color w:val="000000"/>
           <w:kern w:val="0"/>
           <w:sz w:val="24"/>
@@ -2410,7 +2392,7 @@
       </w:pPr>
       <w:r>
         <w:rPr>
-          <w:rFonts w:eastAsia="Times New Roman" w:cs="Times New Roman" w:ascii="Times New Roman" w:hAnsi="Times New Roman"/>
+          <w:rFonts w:eastAsia="Times New Roman" w:cs="Times New Roman"/>
           <w:color w:val="000000"/>
           <w:kern w:val="0"/>
           <w:sz w:val="24"/>
@@ -2440,7 +2422,7 @@
       </w:pPr>
       <w:r>
         <w:rPr>
-          <w:rFonts w:eastAsia="Times New Roman" w:cs="Times New Roman" w:ascii="Times New Roman" w:hAnsi="Times New Roman"/>
+          <w:rFonts w:eastAsia="Times New Roman" w:cs="Times New Roman"/>
           <w:color w:val="000000"/>
           <w:kern w:val="0"/>
           <w:sz w:val="24"/>
@@ -2463,7 +2445,6 @@
       </w:pPr>
       <w:r>
         <w:rPr>
-          <w:rFonts w:ascii="Times New Roman" w:hAnsi="Times New Roman"/>
           <w:lang w:val="es-CO" w:bidi="ar-SA"/>
         </w:rPr>
       </w:r>
@@ -2484,16 +2465,7 @@
           <w:color w:val="auto"/>
           <w:szCs w:val="32"/>
         </w:rPr>
-        <w:t>1.3 Conformación del equipo de trabajo</w:t>
-      </w:r>
-      <w:r>
-        <w:rPr>
-          <w:b/>
-          <w:bCs/>
-          <w:color w:val="auto"/>
-          <w:szCs w:val="32"/>
-        </w:rPr>
-        <w:t xml:space="preserve"> </w:t>
+        <w:t xml:space="preserve">1.3 Conformación del equipo de trabajo </w:t>
       </w:r>
     </w:p>
     <w:p>
@@ -2508,7 +2480,6 @@
       </w:pPr>
       <w:r>
         <w:rPr>
-          <w:rFonts w:ascii="Times New Roman" w:hAnsi="Times New Roman"/>
           <w:b w:val="false"/>
           <w:i w:val="false"/>
           <w:caps w:val="false"/>
@@ -2543,7 +2514,6 @@
       </w:pPr>
       <w:r>
         <w:rPr>
-          <w:rFonts w:ascii="Times New Roman" w:hAnsi="Times New Roman"/>
           <w:b w:val="false"/>
           <w:i w:val="false"/>
           <w:caps w:val="false"/>
@@ -2568,7 +2538,6 @@
       </w:pPr>
       <w:r>
         <w:rPr>
-          <w:rFonts w:ascii="Times New Roman" w:hAnsi="Times New Roman"/>
           <w:b w:val="false"/>
           <w:i w:val="false"/>
           <w:caps w:val="false"/>
@@ -2603,7 +2572,6 @@
       </w:pPr>
       <w:r>
         <w:rPr>
-          <w:rFonts w:ascii="Times New Roman" w:hAnsi="Times New Roman"/>
           <w:b w:val="false"/>
           <w:i w:val="false"/>
           <w:caps w:val="false"/>
@@ -2630,7 +2598,6 @@
       </w:pPr>
       <w:r>
         <w:rPr>
-          <w:rFonts w:ascii="Times New Roman" w:hAnsi="Times New Roman"/>
           <w:b/>
           <w:bCs/>
           <w:i w:val="false"/>
@@ -2646,7 +2613,6 @@
       </w:r>
       <w:r>
         <w:rPr>
-          <w:rFonts w:ascii="Times New Roman" w:hAnsi="Times New Roman"/>
           <w:b w:val="false"/>
           <w:bCs w:val="false"/>
           <w:i w:val="false"/>
@@ -2675,7 +2641,6 @@
       </w:pPr>
       <w:r>
         <w:rPr>
-          <w:rFonts w:ascii="Times New Roman" w:hAnsi="Times New Roman"/>
           <w:b/>
           <w:bCs/>
           <w:i w:val="false"/>
@@ -2691,7 +2656,6 @@
       </w:r>
       <w:r>
         <w:rPr>
-          <w:rFonts w:ascii="Times New Roman" w:hAnsi="Times New Roman"/>
           <w:b w:val="false"/>
           <w:bCs w:val="false"/>
           <w:i w:val="false"/>
@@ -2720,7 +2684,6 @@
       </w:pPr>
       <w:r>
         <w:rPr>
-          <w:rFonts w:ascii="Times New Roman" w:hAnsi="Times New Roman"/>
           <w:b/>
           <w:bCs/>
           <w:i w:val="false"/>
@@ -2736,7 +2699,6 @@
       </w:r>
       <w:r>
         <w:rPr>
-          <w:rFonts w:ascii="Times New Roman" w:hAnsi="Times New Roman"/>
           <w:b w:val="false"/>
           <w:bCs w:val="false"/>
           <w:i w:val="false"/>
@@ -2752,7 +2714,6 @@
       </w:r>
       <w:r>
         <w:rPr>
-          <w:rFonts w:ascii="Times New Roman" w:hAnsi="Times New Roman"/>
           <w:b/>
           <w:bCs/>
           <w:i w:val="false"/>
@@ -2768,7 +2729,6 @@
       </w:r>
       <w:r>
         <w:rPr>
-          <w:rFonts w:ascii="Times New Roman" w:hAnsi="Times New Roman"/>
           <w:b w:val="false"/>
           <w:bCs w:val="false"/>
           <w:i w:val="false"/>
@@ -2798,7 +2758,6 @@
       </w:pPr>
       <w:r>
         <w:rPr>
-          <w:rFonts w:ascii="Times New Roman" w:hAnsi="Times New Roman"/>
           <w:b/>
           <w:bCs/>
           <w:i w:val="false"/>
@@ -2815,7 +2774,6 @@
       </w:r>
       <w:r>
         <w:rPr>
-          <w:rFonts w:ascii="Times New Roman" w:hAnsi="Times New Roman"/>
           <w:b w:val="false"/>
           <w:bCs w:val="false"/>
           <w:i w:val="false"/>
@@ -2851,7 +2809,6 @@
       </w:pPr>
       <w:r>
         <w:rPr>
-          <w:rFonts w:ascii="Times New Roman" w:hAnsi="Times New Roman"/>
           <w:b/>
           <w:bCs/>
           <w:i w:val="false"/>
@@ -2879,7 +2836,6 @@
       </w:pPr>
       <w:r>
         <w:rPr>
-          <w:rFonts w:ascii="Times New Roman" w:hAnsi="Times New Roman"/>
           <w:b/>
           <w:bCs/>
           <w:lang w:val="es-CO" w:bidi="ar-SA"/>
@@ -2905,16 +2861,7 @@
           <w:color w:val="auto"/>
           <w:szCs w:val="32"/>
         </w:rPr>
-        <w:t>2.</w:t>
-      </w:r>
-      <w:r>
-        <w:rPr>
-          <w:b/>
-          <w:bCs/>
-          <w:color w:val="auto"/>
-          <w:szCs w:val="32"/>
-        </w:rPr>
-        <w:t>1</w:t>
+        <w:t>2.1</w:t>
       </w:r>
       <w:r>
         <w:rPr>
@@ -3324,10 +3271,7 @@
         </w:rPr>
       </w:pPr>
       <w:r>
-        <w:rPr>
-          <w:b/>
-          <w:bCs/>
-        </w:rPr>
+        <w:rPr/>
         <w:drawing>
           <wp:inline distT="0" distB="0" distL="0" distR="0">
             <wp:extent cx="5731510" cy="3241040"/>
@@ -3417,7 +3361,6 @@
       </w:pPr>
       <w:r>
         <w:rPr>
-          <w:rFonts w:ascii="Times New Roman" w:hAnsi="Times New Roman"/>
           <w:b/>
           <w:bCs/>
           <w:sz w:val="24"/>
@@ -3530,16 +3473,7 @@
       </w:pPr>
       <w:r>
         <w:rPr>
-          <w:rFonts w:eastAsia="Times New Roman" w:cs="Times New Roman"/>
-          <w:b w:val="false"/>
-          <w:bCs w:val="false"/>
-          <w:color w:val="000000"/>
-          <w:kern w:val="0"/>
-          <w:sz w:val="24"/>
-          <w:szCs w:val="24"/>
-          <w:u w:val="none"/>
-          <w:shd w:fill="FFFFFF" w:val="clear"/>
-          <w:lang w:val="es-CO" w:eastAsia="en-US" w:bidi="ar-SA"/>
+          <w:lang w:val="es-CO" w:bidi="ar-SA"/>
         </w:rPr>
       </w:r>
     </w:p>
@@ -3563,35 +3497,7 @@
           <w:u w:val="none"/>
           <w:lang w:val="es-EC" w:eastAsia="en-US" w:bidi="ar-SA"/>
         </w:rPr>
-        <w:t>3.</w:t>
-      </w:r>
-      <w:r>
-        <w:rPr>
-          <w:rFonts w:eastAsia="Times New Roman" w:cs="Times New Roman"/>
-          <w:b/>
-          <w:bCs/>
-          <w:color w:val="auto"/>
-          <w:kern w:val="0"/>
-          <w:sz w:val="24"/>
-          <w:szCs w:val="24"/>
-          <w:u w:val="none"/>
-          <w:lang w:val="es-EC" w:eastAsia="en-US" w:bidi="ar-SA"/>
-        </w:rPr>
-        <w:t>2</w:t>
-      </w:r>
-      <w:r>
-        <w:rPr>
-          <w:rFonts w:eastAsia="Times New Roman" w:cs="Times New Roman"/>
-          <w:b/>
-          <w:bCs/>
-          <w:color w:val="auto"/>
-          <w:kern w:val="0"/>
-          <w:sz w:val="24"/>
-          <w:szCs w:val="24"/>
-          <w:u w:val="none"/>
-          <w:lang w:val="es-EC" w:eastAsia="en-US" w:bidi="ar-SA"/>
-        </w:rPr>
-        <w:t xml:space="preserve"> Tablero de gestión del proyecto</w:t>
+        <w:t>3.2 Tablero de gestión del proyecto</w:t>
       </w:r>
     </w:p>
     <w:p>
@@ -3604,18 +3510,10 @@
       </w:pPr>
       <w:r>
         <w:rPr>
-          <w:rFonts w:eastAsia="Times New Roman" w:cs="Times New Roman"/>
-          <w:b/>
-          <w:bCs/>
-          <w:color w:val="auto"/>
-          <w:kern w:val="0"/>
-          <w:sz w:val="24"/>
-          <w:szCs w:val="24"/>
-          <w:u w:val="none"/>
-          <w:lang w:val="es-EC" w:eastAsia="en-US" w:bidi="ar-SA"/>
+          <w:lang w:val="es-CO" w:bidi="ar-SA"/>
         </w:rPr>
         <w:drawing>
-          <wp:anchor distT="0" distB="0" distL="114300" distR="114300" simplePos="0" relativeHeight="48" behindDoc="1" locked="0" layoutInCell="0" allowOverlap="1">
+          <wp:anchor distT="0" distB="0" distL="114300" distR="114300" simplePos="0" relativeHeight="37" behindDoc="0" locked="0" layoutInCell="0" allowOverlap="1">
             <wp:simplePos x="0" y="0"/>
             <wp:positionH relativeFrom="column">
               <wp:posOffset>60325</wp:posOffset>
@@ -3629,8 +3527,8 @@
               <wp:wrapPolygon edited="0">
                 <wp:start x="0" y="0"/>
                 <wp:lineTo x="0" y="21356"/>
-                <wp:lineTo x="21529" y="21356"/>
-                <wp:lineTo x="21529" y="0"/>
+                <wp:lineTo x="21528" y="21356"/>
+                <wp:lineTo x="21528" y="0"/>
                 <wp:lineTo x="0" y="0"/>
               </wp:wrapPolygon>
             </wp:wrapThrough>
@@ -3690,35 +3588,7 @@
           <w:u w:val="none"/>
           <w:lang w:val="es-EC" w:eastAsia="en-US" w:bidi="ar-SA"/>
         </w:rPr>
-        <w:t>3.</w:t>
-      </w:r>
-      <w:r>
-        <w:rPr>
-          <w:rFonts w:eastAsia="Times New Roman" w:cs="Times New Roman"/>
-          <w:b/>
-          <w:bCs/>
-          <w:color w:val="auto"/>
-          <w:kern w:val="0"/>
-          <w:sz w:val="24"/>
-          <w:szCs w:val="24"/>
-          <w:u w:val="none"/>
-          <w:lang w:val="es-EC" w:eastAsia="en-US" w:bidi="ar-SA"/>
-        </w:rPr>
-        <w:t>3</w:t>
-      </w:r>
-      <w:r>
-        <w:rPr>
-          <w:rFonts w:eastAsia="Times New Roman" w:cs="Times New Roman"/>
-          <w:b/>
-          <w:bCs/>
-          <w:color w:val="auto"/>
-          <w:kern w:val="0"/>
-          <w:sz w:val="24"/>
-          <w:szCs w:val="24"/>
-          <w:u w:val="none"/>
-          <w:lang w:val="es-EC" w:eastAsia="en-US" w:bidi="ar-SA"/>
-        </w:rPr>
-        <w:t xml:space="preserve"> Organización por sprints o fases ágiles</w:t>
+        <w:t>3.3 Organización por sprints o fases ágiles</w:t>
       </w:r>
     </w:p>
     <w:p>
@@ -3738,17 +3608,7 @@
         </w:rPr>
       </w:pPr>
       <w:r>
-        <w:rPr>
-          <w:rFonts w:eastAsia="Times New Roman" w:cs="Times New Roman"/>
-          <w:b w:val="false"/>
-          <w:bCs w:val="false"/>
-          <w:color w:val="000000"/>
-          <w:kern w:val="0"/>
-          <w:sz w:val="24"/>
-          <w:szCs w:val="24"/>
-          <w:shd w:fill="FFFFFF" w:val="clear"/>
-          <w:lang w:val="es-CO" w:eastAsia="en-US" w:bidi="ar-SA"/>
-        </w:rPr>
+        <w:rPr/>
         <w:drawing>
           <wp:inline distT="0" distB="0" distL="0" distR="0">
             <wp:extent cx="5930265" cy="2882900"/>
@@ -3837,7 +3697,7 @@
       </w:pPr>
       <w:r>
         <w:rPr>
-          <w:rFonts w:eastAsia="Times New Roman" w:cs="Times New Roman" w:ascii="Times New Roman" w:hAnsi="Times New Roman"/>
+          <w:rFonts w:eastAsia="Times New Roman" w:cs="Times New Roman"/>
           <w:b w:val="false"/>
           <w:bCs w:val="false"/>
           <w:color w:val="000000"/>
@@ -3868,7 +3728,7 @@
       </w:pPr>
       <w:r>
         <w:rPr>
-          <w:rFonts w:eastAsia="Times New Roman" w:cs="Times New Roman" w:ascii="Times New Roman" w:hAnsi="Times New Roman"/>
+          <w:rFonts w:eastAsia="Times New Roman" w:cs="Times New Roman"/>
           <w:b w:val="false"/>
           <w:bCs w:val="false"/>
           <w:color w:val="000000"/>
@@ -3899,7 +3759,7 @@
       </w:pPr>
       <w:r>
         <w:rPr>
-          <w:rFonts w:eastAsia="Times New Roman" w:cs="Times New Roman" w:ascii="Times New Roman" w:hAnsi="Times New Roman"/>
+          <w:rFonts w:eastAsia="Times New Roman" w:cs="Times New Roman"/>
           <w:b w:val="false"/>
           <w:bCs w:val="false"/>
           <w:color w:val="000000"/>
@@ -3972,7 +3832,6 @@
       </w:pPr>
       <w:r>
         <w:rPr>
-          <w:rFonts w:ascii="Times New Roman" w:hAnsi="Times New Roman"/>
           <w:sz w:val="24"/>
           <w:szCs w:val="24"/>
         </w:rPr>
@@ -3993,7 +3852,6 @@
       </w:pPr>
       <w:r>
         <w:rPr>
-          <w:rFonts w:ascii="Times New Roman" w:hAnsi="Times New Roman"/>
           <w:b/>
           <w:bCs/>
           <w:sz w:val="24"/>
@@ -4559,17 +4417,7 @@
           <w:sz w:val="24"/>
           <w:szCs w:val="24"/>
         </w:rPr>
-        <w:t>4.</w:t>
-      </w:r>
-      <w:r>
-        <w:rPr>
-          <w:rFonts w:ascii="Times New Roman" w:hAnsi="Times New Roman"/>
-          <w:b/>
-          <w:bCs/>
-          <w:sz w:val="24"/>
-          <w:szCs w:val="24"/>
-        </w:rPr>
-        <w:t>2 User Persona</w:t>
+        <w:t>4.2 User Persona</w:t>
       </w:r>
     </w:p>
     <w:p>
@@ -4614,27 +4462,7 @@
           <w:sz w:val="24"/>
           <w:szCs w:val="24"/>
         </w:rPr>
-        <w:t>User persona-</w:t>
-      </w:r>
-      <w:r>
-        <w:rPr>
-          <w:rFonts w:ascii="Times New Roman" w:hAnsi="Times New Roman"/>
-          <w:b/>
-          <w:bCs/>
-          <w:sz w:val="24"/>
-          <w:szCs w:val="24"/>
-        </w:rPr>
-        <w:t>E</w:t>
-      </w:r>
-      <w:r>
-        <w:rPr>
-          <w:rFonts w:ascii="Times New Roman" w:hAnsi="Times New Roman"/>
-          <w:b/>
-          <w:bCs/>
-          <w:sz w:val="24"/>
-          <w:szCs w:val="24"/>
-        </w:rPr>
-        <w:t>dutech</w:t>
+        <w:t>User persona-Edutech</w:t>
       </w:r>
     </w:p>
     <w:p>
@@ -5106,17 +4934,7 @@
           <w:sz w:val="24"/>
           <w:szCs w:val="24"/>
         </w:rPr>
-        <w:t>4.</w:t>
-      </w:r>
-      <w:r>
-        <w:rPr>
-          <w:rFonts w:ascii="Times New Roman" w:hAnsi="Times New Roman"/>
-          <w:b/>
-          <w:bCs/>
-          <w:sz w:val="24"/>
-          <w:szCs w:val="24"/>
-        </w:rPr>
-        <w:t>3 Mapa de empatía</w:t>
+        <w:t>4.3 Mapa de empatía</w:t>
       </w:r>
     </w:p>
     <w:p>
@@ -5174,11 +4992,11 @@
             <wp:effectExtent l="0" t="0" r="0" b="0"/>
             <wp:wrapThrough wrapText="bothSides">
               <wp:wrapPolygon edited="0">
-                <wp:start x="-29" y="0"/>
-                <wp:lineTo x="-29" y="21339"/>
-                <wp:lineTo x="21511" y="21339"/>
+                <wp:start x="-58" y="0"/>
+                <wp:lineTo x="-58" y="21301"/>
+                <wp:lineTo x="21511" y="21301"/>
                 <wp:lineTo x="21511" y="0"/>
-                <wp:lineTo x="-29" y="0"/>
+                <wp:lineTo x="-58" y="0"/>
               </wp:wrapPolygon>
             </wp:wrapThrough>
             <wp:docPr id="5" name="Imagen5 Copia 1"/>
@@ -5387,17 +5205,7 @@
           <w:sz w:val="24"/>
           <w:szCs w:val="24"/>
         </w:rPr>
-        <w:t>4.</w:t>
-      </w:r>
-      <w:r>
-        <w:rPr>
-          <w:rFonts w:ascii="Times New Roman" w:hAnsi="Times New Roman"/>
-          <w:b/>
-          <w:bCs/>
-          <w:sz w:val="24"/>
-          <w:szCs w:val="24"/>
-        </w:rPr>
-        <w:t>4 Punto de vista (POV)</w:t>
+        <w:t>4.4 Punto de vista (POV)</w:t>
       </w:r>
     </w:p>
     <w:p>
@@ -5511,17 +5319,7 @@
           <w:sz w:val="24"/>
           <w:szCs w:val="24"/>
         </w:rPr>
-        <w:t>4.</w:t>
-      </w:r>
-      <w:r>
-        <w:rPr>
-          <w:rFonts w:ascii="Times New Roman" w:hAnsi="Times New Roman"/>
-          <w:b/>
-          <w:bCs/>
-          <w:sz w:val="24"/>
-          <w:szCs w:val="24"/>
-        </w:rPr>
-        <w:t>5 Ideación y propuesta de solución</w:t>
+        <w:t>4.5 Ideación y propuesta de solución</w:t>
       </w:r>
     </w:p>
     <w:p>
@@ -5615,47 +5413,7 @@
           <w:sz w:val="24"/>
           <w:szCs w:val="24"/>
         </w:rPr>
-        <w:t xml:space="preserve">Para dar una solución se propone </w:t>
-      </w:r>
-      <w:r>
-        <w:rPr>
-          <w:rFonts w:ascii="Times New Roman" w:hAnsi="Times New Roman"/>
-          <w:b w:val="false"/>
-          <w:bCs w:val="false"/>
-          <w:sz w:val="24"/>
-          <w:szCs w:val="24"/>
-        </w:rPr>
-        <w:t>E</w:t>
-      </w:r>
-      <w:r>
-        <w:rPr>
-          <w:rFonts w:ascii="Times New Roman" w:hAnsi="Times New Roman"/>
-          <w:b w:val="false"/>
-          <w:bCs w:val="false"/>
-          <w:sz w:val="24"/>
-          <w:szCs w:val="24"/>
-        </w:rPr>
-        <w:t>duTech una plataforma web orientada a la gestión de actividades académicas que permite la mejora continua y la interacción entre estudiantes y d</w:t>
-      </w:r>
-      <w:r>
-        <w:rPr>
-          <w:rFonts w:ascii="Times New Roman" w:hAnsi="Times New Roman"/>
-          <w:b w:val="false"/>
-          <w:bCs w:val="false"/>
-          <w:sz w:val="24"/>
-          <w:szCs w:val="24"/>
-        </w:rPr>
-        <w:t>o</w:t>
-      </w:r>
-      <w:r>
-        <w:rPr>
-          <w:rFonts w:ascii="Times New Roman" w:hAnsi="Times New Roman"/>
-          <w:b w:val="false"/>
-          <w:bCs w:val="false"/>
-          <w:sz w:val="24"/>
-          <w:szCs w:val="24"/>
-        </w:rPr>
-        <w:t xml:space="preserve">centes </w:t>
+        <w:t xml:space="preserve">Para dar una solución se propone EduTech una plataforma web orientada a la gestión de actividades académicas que permite la mejora continua y la interacción entre estudiantes y docentes </w:t>
       </w:r>
     </w:p>
     <w:p>
@@ -6035,8 +5793,7 @@
       </w:pPr>
       <w:r>
         <w:rPr>
-          <w:b/>
-          <w:bCs/>
+          <w:lang w:val="es-CO" w:bidi="ar-SA"/>
         </w:rPr>
       </w:r>
     </w:p>
@@ -6084,7 +5841,7 @@
       </w:pPr>
       <w:r>
         <w:rPr>
-          <w:rFonts w:eastAsia="Times New Roman" w:cs="Times New Roman" w:ascii="Times New Roman" w:hAnsi="Times New Roman"/>
+          <w:rFonts w:eastAsia="Times New Roman" w:cs="Times New Roman"/>
           <w:b w:val="false"/>
           <w:bCs w:val="false"/>
           <w:vanish w:val="false"/>
@@ -6125,7 +5882,7 @@
       </w:pPr>
       <w:r>
         <w:rPr>
-          <w:rFonts w:eastAsia="Times New Roman" w:cs="Times New Roman" w:ascii="Times New Roman" w:hAnsi="Times New Roman"/>
+          <w:rFonts w:eastAsia="Times New Roman" w:cs="Times New Roman"/>
           <w:b w:val="false"/>
           <w:bCs w:val="false"/>
           <w:vanish w:val="false"/>
@@ -6255,7 +6012,7 @@
       <w:r>
         <w:rPr/>
         <w:drawing>
-          <wp:anchor distT="0" distB="0" distL="0" distR="0" simplePos="0" relativeHeight="42" behindDoc="0" locked="0" layoutInCell="0" allowOverlap="1">
+          <wp:anchor distT="0" distB="0" distL="0" distR="0" simplePos="0" relativeHeight="45" behindDoc="0" locked="0" layoutInCell="0" allowOverlap="1">
             <wp:simplePos x="0" y="0"/>
             <wp:positionH relativeFrom="column">
               <wp:posOffset>0</wp:posOffset>
@@ -6368,7 +6125,7 @@
           <w:bCs/>
         </w:rPr>
         <w:drawing>
-          <wp:anchor distT="0" distB="0" distL="0" distR="0" simplePos="0" relativeHeight="43" behindDoc="0" locked="0" layoutInCell="0" allowOverlap="1">
+          <wp:anchor distT="0" distB="0" distL="0" distR="0" simplePos="0" relativeHeight="46" behindDoc="0" locked="0" layoutInCell="0" allowOverlap="1">
             <wp:simplePos x="0" y="0"/>
             <wp:positionH relativeFrom="column">
               <wp:posOffset>0</wp:posOffset>
@@ -6536,7 +6293,7 @@
         <w:r>
           <w:rPr/>
           <w:drawing>
-            <wp:anchor distT="0" distB="0" distL="0" distR="0" simplePos="0" relativeHeight="44" behindDoc="0" locked="0" layoutInCell="0" allowOverlap="1">
+            <wp:anchor distT="0" distB="0" distL="0" distR="0" simplePos="0" relativeHeight="47" behindDoc="0" locked="0" layoutInCell="0" allowOverlap="1">
               <wp:simplePos x="0" y="0"/>
               <wp:positionH relativeFrom="column">
                 <wp:posOffset>32385</wp:posOffset>
@@ -6705,7 +6462,7 @@
           <w:bCs/>
         </w:rPr>
         <w:drawing>
-          <wp:anchor distT="0" distB="0" distL="0" distR="0" simplePos="0" relativeHeight="45" behindDoc="0" locked="0" layoutInCell="0" allowOverlap="1">
+          <wp:anchor distT="0" distB="0" distL="0" distR="0" simplePos="0" relativeHeight="48" behindDoc="0" locked="0" layoutInCell="0" allowOverlap="1">
             <wp:simplePos x="0" y="0"/>
             <wp:positionH relativeFrom="column">
               <wp:posOffset>27305</wp:posOffset>
@@ -6814,7 +6571,7 @@
           <w:bCs/>
         </w:rPr>
         <w:drawing>
-          <wp:anchor distT="0" distB="0" distL="0" distR="0" simplePos="0" relativeHeight="46" behindDoc="0" locked="0" layoutInCell="0" allowOverlap="1">
+          <wp:anchor distT="0" distB="0" distL="0" distR="0" simplePos="0" relativeHeight="49" behindDoc="0" locked="0" layoutInCell="0" allowOverlap="1">
             <wp:simplePos x="0" y="0"/>
             <wp:positionH relativeFrom="column">
               <wp:posOffset>3810</wp:posOffset>
@@ -7003,8 +6760,6 @@
       <w:r>
         <w:rPr>
           <w:rFonts w:eastAsia="Times New Roman" w:cs="Times New Roman"/>
-          <w:b/>
-          <w:bCs/>
           <w:color w:val="auto"/>
           <w:kern w:val="0"/>
           <w:sz w:val="24"/>
@@ -7035,8 +6790,6 @@
       <w:r>
         <w:rPr>
           <w:rFonts w:eastAsia="Times New Roman" w:cs="Times New Roman"/>
-          <w:b/>
-          <w:bCs/>
           <w:color w:val="auto"/>
           <w:kern w:val="0"/>
           <w:sz w:val="24"/>
@@ -7045,7 +6798,7 @@
           <w:lang w:val="es-EC" w:eastAsia="en-US" w:bidi="ar-SA"/>
         </w:rPr>
         <w:drawing>
-          <wp:anchor distT="0" distB="0" distL="114300" distR="114300" simplePos="0" relativeHeight="35" behindDoc="0" locked="0" layoutInCell="0" allowOverlap="1">
+          <wp:anchor distT="0" distB="0" distL="114300" distR="114300" simplePos="0" relativeHeight="38" behindDoc="0" locked="0" layoutInCell="0" allowOverlap="1">
             <wp:simplePos x="0" y="0"/>
             <wp:positionH relativeFrom="column">
               <wp:posOffset>-23495</wp:posOffset>
@@ -7057,11 +6810,11 @@
             <wp:effectExtent l="0" t="0" r="0" b="0"/>
             <wp:wrapThrough wrapText="bothSides">
               <wp:wrapPolygon edited="0">
-                <wp:start x="-61" y="0"/>
-                <wp:lineTo x="-61" y="21360"/>
-                <wp:lineTo x="21557" y="21360"/>
+                <wp:start x="-81" y="0"/>
+                <wp:lineTo x="-81" y="21324"/>
+                <wp:lineTo x="21557" y="21324"/>
                 <wp:lineTo x="21557" y="0"/>
-                <wp:lineTo x="-61" y="0"/>
+                <wp:lineTo x="-81" y="0"/>
               </wp:wrapPolygon>
             </wp:wrapThrough>
             <wp:docPr id="11" name="Imagen 1"/>
@@ -7578,7 +7331,7 @@
       </w:pPr>
       <w:r>
         <w:rPr>
-          <w:rFonts w:eastAsia="Times New Roman" w:cs="Times New Roman" w:ascii="Times New Roman" w:hAnsi="Times New Roman"/>
+          <w:rFonts w:eastAsia="Times New Roman" w:cs="Times New Roman"/>
           <w:color w:val="auto"/>
           <w:kern w:val="0"/>
           <w:sz w:val="24"/>
@@ -7590,7 +7343,7 @@
       </w:r>
       <w:r>
         <w:rPr>
-          <w:rFonts w:eastAsia="Times New Roman" w:cs="Times New Roman" w:ascii="Times New Roman" w:hAnsi="Times New Roman"/>
+          <w:rFonts w:eastAsia="Times New Roman" w:cs="Times New Roman"/>
           <w:b w:val="false"/>
           <w:bCs w:val="false"/>
           <w:color w:val="auto"/>
@@ -7600,21 +7353,7 @@
           <w:u w:val="none"/>
           <w:lang w:val="es-CO" w:eastAsia="en-US" w:bidi="ar-SA"/>
         </w:rPr>
-        <w:t>E</w:t>
-      </w:r>
-      <w:r>
-        <w:rPr>
-          <w:rFonts w:eastAsia="Times New Roman" w:cs="Times New Roman" w:ascii="Times New Roman" w:hAnsi="Times New Roman"/>
-          <w:b w:val="false"/>
-          <w:bCs w:val="false"/>
-          <w:color w:val="auto"/>
-          <w:kern w:val="0"/>
-          <w:sz w:val="24"/>
-          <w:szCs w:val="24"/>
-          <w:u w:val="none"/>
-          <w:lang w:val="es-CO" w:eastAsia="en-US" w:bidi="ar-SA"/>
-        </w:rPr>
-        <w:t>l objetivo sera desarrollar las funcionalidades básicas del sistema relacionadas con todo el tema de la gestión de usuarios autentificación y las acciones básicas de los diferentes roles garantizando la interfaz estable y el almacenamiento correcto de información.</w:t>
+        <w:t>El objetivo sera desarrollar las funcionalidades básicas del sistema relacionadas con todo el tema de la gestión de usuarios autentificación y las acciones básicas de los diferentes roles garantizando la interfaz estable y el almacenamiento correcto de información.</w:t>
       </w:r>
     </w:p>
     <w:p>
@@ -7637,7 +7376,7 @@
       </w:pPr>
       <w:r>
         <w:rPr>
-          <w:rFonts w:eastAsia="Times New Roman" w:cs="Times New Roman" w:ascii="Times New Roman" w:hAnsi="Times New Roman"/>
+          <w:rFonts w:eastAsia="Times New Roman" w:cs="Times New Roman"/>
           <w:color w:val="auto"/>
           <w:kern w:val="0"/>
           <w:sz w:val="24"/>
@@ -7645,19 +7384,7 @@
           <w:u w:val="none"/>
           <w:lang w:val="es-CO" w:eastAsia="en-US" w:bidi="ar-SA"/>
         </w:rPr>
-        <w:t>A</w:t>
-      </w:r>
-      <w:r>
-        <w:rPr>
-          <w:rFonts w:eastAsia="Times New Roman" w:cs="Times New Roman" w:ascii="Times New Roman" w:hAnsi="Times New Roman"/>
-          <w:color w:val="auto"/>
-          <w:kern w:val="0"/>
-          <w:sz w:val="24"/>
-          <w:szCs w:val="24"/>
-          <w:u w:val="none"/>
-          <w:lang w:val="es-CO" w:eastAsia="en-US" w:bidi="ar-SA"/>
-        </w:rPr>
-        <w:t>lcance:</w:t>
+        <w:t>Alcance:</w:t>
       </w:r>
     </w:p>
     <w:p>
@@ -7686,7 +7413,7 @@
       </w:pPr>
       <w:r>
         <w:rPr>
-          <w:rFonts w:eastAsia="Times New Roman" w:cs="Times New Roman" w:ascii="Times New Roman" w:hAnsi="Times New Roman"/>
+          <w:rFonts w:eastAsia="Times New Roman" w:cs="Times New Roman"/>
           <w:b w:val="false"/>
           <w:bCs w:val="false"/>
           <w:color w:val="auto"/>
@@ -7725,7 +7452,7 @@
       </w:pPr>
       <w:r>
         <w:rPr>
-          <w:rFonts w:eastAsia="Times New Roman" w:cs="Times New Roman" w:ascii="Times New Roman" w:hAnsi="Times New Roman"/>
+          <w:rFonts w:eastAsia="Times New Roman" w:cs="Times New Roman"/>
           <w:b w:val="false"/>
           <w:bCs w:val="false"/>
           <w:color w:val="auto"/>
@@ -7764,7 +7491,7 @@
       </w:pPr>
       <w:r>
         <w:rPr>
-          <w:rFonts w:eastAsia="Times New Roman" w:cs="Times New Roman" w:ascii="Times New Roman" w:hAnsi="Times New Roman"/>
+          <w:rFonts w:eastAsia="Times New Roman" w:cs="Times New Roman"/>
           <w:b w:val="false"/>
           <w:bCs w:val="false"/>
           <w:color w:val="auto"/>
@@ -7797,7 +7524,7 @@
       </w:pPr>
       <w:r>
         <w:rPr>
-          <w:rFonts w:eastAsia="Times New Roman" w:cs="Times New Roman" w:ascii="Times New Roman" w:hAnsi="Times New Roman"/>
+          <w:rFonts w:eastAsia="Times New Roman" w:cs="Times New Roman"/>
           <w:color w:val="auto"/>
           <w:kern w:val="0"/>
           <w:sz w:val="24"/>
@@ -7805,19 +7532,7 @@
           <w:u w:val="none"/>
           <w:lang w:val="es-CO" w:eastAsia="en-US" w:bidi="ar-SA"/>
         </w:rPr>
-        <w:t>Roles del Equipo</w:t>
-      </w:r>
-      <w:r>
-        <w:rPr>
-          <w:rFonts w:eastAsia="Times New Roman" w:cs="Times New Roman" w:ascii="Times New Roman" w:hAnsi="Times New Roman"/>
-          <w:color w:val="auto"/>
-          <w:kern w:val="0"/>
-          <w:sz w:val="24"/>
-          <w:szCs w:val="24"/>
-          <w:u w:val="none"/>
-          <w:lang w:val="es-CO" w:eastAsia="en-US" w:bidi="ar-SA"/>
-        </w:rPr>
-        <w:t>:</w:t>
+        <w:t>Roles del Equipo:</w:t>
       </w:r>
     </w:p>
     <w:p>
@@ -7886,21 +7601,7 @@
           <w:u w:val="none"/>
           <w:lang w:val="es-CO" w:eastAsia="en-US" w:bidi="ar-SA"/>
         </w:rPr>
-        <w:t>F</w:t>
-      </w:r>
-      <w:r>
-        <w:rPr>
-          <w:rFonts w:eastAsia="Times New Roman" w:cs="Times New Roman"/>
-          <w:b w:val="false"/>
-          <w:bCs w:val="false"/>
-          <w:color w:val="auto"/>
-          <w:kern w:val="0"/>
-          <w:sz w:val="24"/>
-          <w:szCs w:val="24"/>
-          <w:u w:val="none"/>
-          <w:lang w:val="es-CO" w:eastAsia="en-US" w:bidi="ar-SA"/>
-        </w:rPr>
-        <w:t>acilitará el desarrollo del sprint, organizando reuniones, eliminando impedimentos y garantizando que el equipo siga la metodología ágil.</w:t>
+        <w:t>Facilitará el desarrollo del sprint, organizando reuniones, eliminando impedimentos y garantizando que el equipo siga la metodología ágil.</w:t>
       </w:r>
       <w:r>
         <w:rPr>
@@ -7930,21 +7631,7 @@
           <w:u w:val="none"/>
           <w:lang w:val="es-CO" w:eastAsia="en-US" w:bidi="ar-SA"/>
         </w:rPr>
-        <w:t>I</w:t>
-      </w:r>
-      <w:r>
-        <w:rPr>
-          <w:rFonts w:eastAsia="Times New Roman" w:cs="Times New Roman"/>
-          <w:b w:val="false"/>
-          <w:bCs w:val="false"/>
-          <w:color w:val="auto"/>
-          <w:kern w:val="0"/>
-          <w:sz w:val="24"/>
-          <w:szCs w:val="24"/>
-          <w:u w:val="none"/>
-          <w:lang w:val="es-CO" w:eastAsia="en-US" w:bidi="ar-SA"/>
-        </w:rPr>
-        <w:t>mplementará las funcionalidades clave, incluyendo el registro e inicio de sesión, la gestión del perfil de usuario y el CRUD de actividades para docentes, además de estructurar la base de datos y la lógica del sistema.</w:t>
+        <w:t>Implementará las funcionalidades clave, incluyendo el registro e inicio de sesión, la gestión del perfil de usuario y el CRUD de actividades para docentes, además de estructurar la base de datos y la lógica del sistema.</w:t>
       </w:r>
       <w:r>
         <w:rPr>
@@ -7974,21 +7661,7 @@
           <w:u w:val="none"/>
           <w:lang w:val="es-CO" w:eastAsia="en-US" w:bidi="ar-SA"/>
         </w:rPr>
-        <w:t>V</w:t>
-      </w:r>
-      <w:r>
-        <w:rPr>
-          <w:rFonts w:eastAsia="Times New Roman" w:cs="Times New Roman"/>
-          <w:b w:val="false"/>
-          <w:bCs w:val="false"/>
-          <w:color w:val="auto"/>
-          <w:kern w:val="0"/>
-          <w:sz w:val="24"/>
-          <w:szCs w:val="24"/>
-          <w:u w:val="none"/>
-          <w:lang w:val="es-CO" w:eastAsia="en-US" w:bidi="ar-SA"/>
-        </w:rPr>
-        <w:t>alidará que todas las funcionalidades desarrolladas funcionen correctamente, verificando la seguridad de los datos, la correcta autenticación y la usabilidad de la interfaz.</w:t>
+        <w:t>Validará que todas las funcionalidades desarrolladas funcionen correctamente, verificando la seguridad de los datos, la correcta autenticación y la usabilidad de la interfaz.</w:t>
       </w:r>
       <w:r>
         <w:rPr>
@@ -8040,9 +7713,7 @@
       </w:pPr>
       <w:r>
         <w:rPr>
-          <w:rFonts w:eastAsia="Times New Roman" w:cs="Times New Roman" w:ascii="Times New Roman" w:hAnsi="Times New Roman"/>
-          <w:b w:val="false"/>
-          <w:bCs w:val="false"/>
+          <w:rFonts w:eastAsia="Times New Roman" w:cs="Times New Roman"/>
           <w:color w:val="auto"/>
           <w:kern w:val="0"/>
           <w:sz w:val="24"/>
@@ -8244,7 +7915,7 @@
           <w:lang w:val="es-CO" w:eastAsia="en-US" w:bidi="ar-SA"/>
         </w:rPr>
         <w:drawing>
-          <wp:anchor distT="0" distB="0" distL="0" distR="0" simplePos="0" relativeHeight="37" behindDoc="0" locked="0" layoutInCell="0" allowOverlap="1">
+          <wp:anchor distT="0" distB="0" distL="0" distR="0" simplePos="0" relativeHeight="40" behindDoc="0" locked="0" layoutInCell="0" allowOverlap="1">
             <wp:simplePos x="0" y="0"/>
             <wp:positionH relativeFrom="column">
               <wp:posOffset>-15240</wp:posOffset>
@@ -8399,7 +8070,7 @@
           <w:bCs w:val="false"/>
         </w:rPr>
         <w:drawing>
-          <wp:anchor distT="0" distB="0" distL="0" distR="0" simplePos="0" relativeHeight="38" behindDoc="0" locked="0" layoutInCell="0" allowOverlap="1">
+          <wp:anchor distT="0" distB="0" distL="0" distR="0" simplePos="0" relativeHeight="41" behindDoc="0" locked="0" layoutInCell="0" allowOverlap="1">
             <wp:simplePos x="0" y="0"/>
             <wp:positionH relativeFrom="column">
               <wp:posOffset>-5715</wp:posOffset>
@@ -8589,7 +8260,7 @@
       </w:pPr>
       <w:r>
         <w:rPr>
-          <w:rFonts w:eastAsia="Times New Roman" w:cs="Times New Roman" w:ascii="Times New Roman" w:hAnsi="Times New Roman"/>
+          <w:rFonts w:eastAsia="Times New Roman" w:cs="Times New Roman"/>
           <w:color w:val="auto"/>
           <w:kern w:val="0"/>
           <w:sz w:val="24"/>
@@ -8598,7 +8269,7 @@
           <w:lang w:val="es-CO" w:eastAsia="en-US" w:bidi="ar-SA"/>
         </w:rPr>
         <w:drawing>
-          <wp:anchor distT="0" distB="0" distL="0" distR="0" simplePos="0" relativeHeight="39" behindDoc="0" locked="0" layoutInCell="0" allowOverlap="1">
+          <wp:anchor distT="0" distB="0" distL="0" distR="0" simplePos="0" relativeHeight="42" behindDoc="0" locked="0" layoutInCell="0" allowOverlap="1">
             <wp:simplePos x="0" y="0"/>
             <wp:positionH relativeFrom="column">
               <wp:posOffset>0</wp:posOffset>
@@ -8823,7 +8494,7 @@
       </w:pPr>
       <w:r>
         <w:rPr>
-          <w:rFonts w:eastAsia="Times New Roman" w:cs="Times New Roman" w:ascii="Times New Roman" w:hAnsi="Times New Roman"/>
+          <w:rFonts w:eastAsia="Times New Roman" w:cs="Times New Roman"/>
           <w:color w:val="auto"/>
           <w:kern w:val="0"/>
           <w:sz w:val="24"/>
@@ -8832,7 +8503,7 @@
           <w:lang w:val="es-EC" w:eastAsia="en-US" w:bidi="ar-SA"/>
         </w:rPr>
         <w:drawing>
-          <wp:anchor distT="0" distB="0" distL="0" distR="0" simplePos="0" relativeHeight="40" behindDoc="0" locked="0" layoutInCell="0" allowOverlap="1">
+          <wp:anchor distT="0" distB="0" distL="0" distR="0" simplePos="0" relativeHeight="43" behindDoc="0" locked="0" layoutInCell="0" allowOverlap="1">
             <wp:simplePos x="0" y="0"/>
             <wp:positionH relativeFrom="column">
               <wp:posOffset>12065</wp:posOffset>
@@ -9016,7 +8687,7 @@
       </w:pPr>
       <w:r>
         <w:rPr>
-          <w:rFonts w:eastAsia="Times New Roman" w:cs="Times New Roman" w:ascii="Times New Roman" w:hAnsi="Times New Roman"/>
+          <w:rFonts w:eastAsia="Times New Roman" w:cs="Times New Roman"/>
           <w:color w:val="auto"/>
           <w:kern w:val="0"/>
           <w:sz w:val="24"/>
@@ -9025,7 +8696,7 @@
           <w:lang w:val="es-EC" w:eastAsia="en-US" w:bidi="ar-SA"/>
         </w:rPr>
         <w:drawing>
-          <wp:anchor distT="0" distB="0" distL="0" distR="0" simplePos="0" relativeHeight="41" behindDoc="0" locked="0" layoutInCell="0" allowOverlap="1">
+          <wp:anchor distT="0" distB="0" distL="0" distR="0" simplePos="0" relativeHeight="44" behindDoc="0" locked="0" layoutInCell="0" allowOverlap="1">
             <wp:simplePos x="0" y="0"/>
             <wp:positionH relativeFrom="column">
               <wp:posOffset>0</wp:posOffset>
@@ -9384,21 +9055,7 @@
           <w:b/>
           <w:bCs/>
         </w:rPr>
-        <w:t>9</w:t>
-      </w:r>
-      <w:r>
-        <w:rPr>
-          <w:b/>
-          <w:bCs/>
-        </w:rPr>
-        <w:t xml:space="preserve">. </w:t>
-      </w:r>
-      <w:r>
-        <w:rPr>
-          <w:b/>
-          <w:bCs/>
-        </w:rPr>
-        <w:t>Anexos</w:t>
+        <w:t>9. Anexos</w:t>
       </w:r>
     </w:p>
     <w:p>
@@ -9513,7 +9170,7 @@
       <mc:AlternateContent>
         <mc:Choice Requires="wps">
           <w:drawing>
-            <wp:anchor distT="0" distB="0" distL="0" distR="0" simplePos="0" relativeHeight="2" behindDoc="1" locked="0" layoutInCell="0" allowOverlap="1">
+            <wp:anchor distT="0" distB="0" distL="0" distR="0" simplePos="0" relativeHeight="4" behindDoc="1" locked="0" layoutInCell="0" allowOverlap="1">
               <wp:simplePos x="0" y="0"/>
               <wp:positionH relativeFrom="margin">
                 <wp:align>right</wp:align>
@@ -9683,7 +9340,7 @@
       <mc:AlternateContent>
         <mc:Choice Requires="wps">
           <w:drawing>
-            <wp:anchor distT="0" distB="0" distL="0" distR="0" simplePos="0" relativeHeight="33" behindDoc="1" locked="0" layoutInCell="0" allowOverlap="1">
+            <wp:anchor distT="0" distB="0" distL="0" distR="0" simplePos="0" relativeHeight="35" behindDoc="1" locked="0" layoutInCell="0" allowOverlap="1">
               <wp:simplePos x="0" y="0"/>
               <wp:positionH relativeFrom="margin">
                 <wp:align>right</wp:align>
@@ -11308,8 +10965,8 @@
       <w:u w:val="single"/>
     </w:rPr>
   </w:style>
-  <w:style w:type="character" w:styleId="Caracteresdenotaalpie">
-    <w:name w:val="Caracteres de nota al pie"/>
+  <w:style w:type="character" w:styleId="Caracteresdenotaalpieuser">
+    <w:name w:val="Caracteres de nota al pie (user)"/>
     <w:semiHidden/>
     <w:qFormat/>
     <w:rsid w:val="004d41be"/>
@@ -11317,8 +10974,8 @@
       <w:vertAlign w:val="superscript"/>
     </w:rPr>
   </w:style>
-  <w:style w:type="character" w:styleId="Caracteresdenotaalpieuser">
-    <w:name w:val="Caracteres de nota al pie (user)"/>
+  <w:style w:type="character" w:styleId="Caracteresdenotaalpie">
+    <w:name w:val="Caracteres de nota al pie"/>
     <w:qFormat/>
     <w:rPr>
       <w:vertAlign w:val="superscript"/>
@@ -11472,13 +11129,13 @@
       <w:shd w:fill="E1DFDD" w:val="clear"/>
     </w:rPr>
   </w:style>
-  <w:style w:type="character" w:styleId="Enlacedelndice">
-    <w:name w:val="Enlace del índice"/>
+  <w:style w:type="character" w:styleId="Enlacedelndiceuser">
+    <w:name w:val="Enlace del índice (user)"/>
     <w:qFormat/>
     <w:rPr/>
   </w:style>
-  <w:style w:type="character" w:styleId="Bolos">
-    <w:name w:val="Bolos"/>
+  <w:style w:type="character" w:styleId="Bolosuser">
+    <w:name w:val="Bolos (user)"/>
     <w:qFormat/>
     <w:rPr>
       <w:rFonts w:ascii="OpenSymbol" w:hAnsi="OpenSymbol" w:eastAsia="OpenSymbol" w:cs="OpenSymbol"/>
@@ -11492,25 +11149,25 @@
       <w:iCs/>
     </w:rPr>
   </w:style>
-  <w:style w:type="character" w:styleId="Textooriginal">
-    <w:name w:val="Texto original"/>
+  <w:style w:type="character" w:styleId="Textooriginaluser">
+    <w:name w:val="Texto original (user)"/>
     <w:qFormat/>
     <w:rPr>
       <w:rFonts w:ascii="Liberation Mono" w:hAnsi="Liberation Mono" w:eastAsia="Liberation Mono" w:cs="Liberation Mono"/>
     </w:rPr>
   </w:style>
-  <w:style w:type="character" w:styleId="Smbolosdenumeracin">
-    <w:name w:val="Símbolos de numeración"/>
+  <w:style w:type="character" w:styleId="Smbolosdenumeracinuser">
+    <w:name w:val="Símbolos de numeración (user)"/>
     <w:qFormat/>
     <w:rPr/>
   </w:style>
-  <w:style w:type="character" w:styleId="Enlacedelndiceuser">
-    <w:name w:val="Enlace del índice (user)"/>
+  <w:style w:type="character" w:styleId="Enlacedelndice">
+    <w:name w:val="Enlace del índice"/>
     <w:qFormat/>
     <w:rPr/>
   </w:style>
-  <w:style w:type="character" w:styleId="Bolosuser">
-    <w:name w:val="Bolos (user)"/>
+  <w:style w:type="character" w:styleId="Bolos">
+    <w:name w:val="Bolos"/>
     <w:qFormat/>
     <w:rPr>
       <w:rFonts w:ascii="OpenSymbol" w:hAnsi="OpenSymbol" w:eastAsia="OpenSymbol" w:cs="OpenSymbol"/>
@@ -11821,15 +11478,15 @@
       <w:lang w:val="es-ES_tradnl" w:eastAsia="es-ES_tradnl" w:bidi="ar-SA"/>
     </w:rPr>
   </w:style>
-  <w:style w:type="paragraph" w:styleId="Cabeceraypie">
-    <w:name w:val="Cabecera y pie"/>
+  <w:style w:type="paragraph" w:styleId="Cabeceraypieuser">
+    <w:name w:val="Cabecera y pie (user)"/>
     <w:basedOn w:val="Normal"/>
     <w:qFormat/>
     <w:pPr/>
     <w:rPr/>
   </w:style>
-  <w:style w:type="paragraph" w:styleId="Cabeceraypieuser">
-    <w:name w:val="Cabecera y pie (user)"/>
+  <w:style w:type="paragraph" w:styleId="Cabeceraypie">
+    <w:name w:val="Cabecera y pie"/>
     <w:basedOn w:val="Normal"/>
     <w:qFormat/>
     <w:pPr/>
@@ -12399,7 +12056,7 @@
   </w:style>
   <w:style w:type="paragraph" w:styleId="IndexHeading">
     <w:name w:val="index heading"/>
-    <w:basedOn w:val="Ttulo"/>
+    <w:basedOn w:val="Ttulouser"/>
     <w:pPr/>
     <w:rPr/>
   </w:style>
@@ -12425,15 +12082,15 @@
       <w:szCs w:val="28"/>
     </w:rPr>
   </w:style>
-  <w:style w:type="paragraph" w:styleId="Contenidodelmarco">
-    <w:name w:val="Contenido del marco"/>
+  <w:style w:type="paragraph" w:styleId="Contenidodelmarcouser">
+    <w:name w:val="Contenido del marco (user)"/>
     <w:basedOn w:val="Normal"/>
     <w:qFormat/>
     <w:pPr/>
     <w:rPr/>
   </w:style>
-  <w:style w:type="paragraph" w:styleId="Contenidodelmarcouser">
-    <w:name w:val="Contenido del marco (user)"/>
+  <w:style w:type="paragraph" w:styleId="Contenidodelmarco">
+    <w:name w:val="Contenido del marco"/>
     <w:basedOn w:val="Normal"/>
     <w:qFormat/>
     <w:pPr/>
@@ -12457,8 +12114,8 @@
       <w:lang w:val="es-CO"/>
     </w:rPr>
   </w:style>
-  <w:style w:type="numbering" w:styleId="Ningunalistauser" w:default="1">
-    <w:name w:val="Ninguna lista (user)"/>
+  <w:style w:type="numbering" w:styleId="Ningunalista" w:default="1">
+    <w:name w:val="Ninguna lista"/>
     <w:uiPriority w:val="99"/>
     <w:semiHidden/>
     <w:unhideWhenUsed/>

</xml_diff>